<commit_message>
Keep AI Times note limited to its own article
Co-Authored-By: Claude Opus 5.5 <noreply@anthropic.com>
Claude-Session: https://claude.ai/code/session_017ucVKmTkYn7CaHFoQdgegj
</commit_message>
<xml_diff>
--- a/llm-wiki/[인공지능신문-2026-09-30-美 정부, ‘AI’ 대신 ‘슈퍼 인텔리전스(SI)’ 쓴다…트럼프, “새로운 지능 시대 개막”].docx
+++ b/llm-wiki/[인공지능신문-2026-09-30-美 정부, ‘AI’ 대신 ‘슈퍼 인텔리전스(SI)’ 쓴다…트럼프, “새로운 지능 시대 개막”].docx
@@ -1129,15 +1129,15 @@
           <w:sz w:val="21"/>
           <w:szCs w:val="21"/>
         </w:rPr>
-        <w:t xml:space="preserve">행정명령(Executive Order): </w:t>
-      </w:r>
-      <w:r>
-        <w:rPr>
-          <w:rFonts w:ascii="Malgun Gothic" w:cs="Malgun Gothic" w:eastAsia="Malgun Gothic" w:hAnsi="Malgun Gothic"/>
-          <w:sz w:val="21"/>
-          <w:szCs w:val="21"/>
-        </w:rPr>
-        <w:t xml:space="preserve">대통령이 행정부에 내리는 지시. 의회 입법 없이 법률 자체를 바꿀 수는 없음 — 이번 기사의 ‘명칭 vs 법적 지위’ 구분의 근거.</w:t>
+        <w:t xml:space="preserve">슈퍼 인텔리전스(SI): </w:t>
+      </w:r>
+      <w:r>
+        <w:rPr>
+          <w:rFonts w:ascii="Malgun Gothic" w:cs="Malgun Gothic" w:eastAsia="Malgun Gothic" w:hAnsi="Malgun Gothic"/>
+          <w:sz w:val="21"/>
+          <w:szCs w:val="21"/>
+        </w:rPr>
+        <w:t xml:space="preserve">이번 행정명령상 현행 미국 법률의 ‘인공지능’ 정의에 해당하는 기술·시스템을 가리키는 용어. 별도의 연방 법적 정의는 60일 내 입법 문안으로 마련 예정.</w:t>
       </w:r>
     </w:p>
     <w:p>
@@ -1165,35 +1165,35 @@
           <w:sz w:val="21"/>
           <w:szCs w:val="21"/>
         </w:rPr>
-        <w:t xml:space="preserve">법률·규정처럼 법적 효력을 갖지 않는 행정 문서(서신, 웹사이트, 보고서 등).</w:t>
-      </w:r>
-    </w:p>
-    <w:p>
-      <w:pPr>
-        <w:pStyle w:val="ListParagraph"/>
-        <w:numPr>
-          <w:ilvl w:val="0"/>
-          <w:numId w:val="2"/>
-        </w:numPr>
-        <w:spacing w:after="80" w:line="300"/>
-      </w:pPr>
-      <w:r>
-        <w:rPr>
-          <w:rFonts w:ascii="Malgun Gothic" w:cs="Malgun Gothic" w:eastAsia="Malgun Gothic" w:hAnsi="Malgun Gothic"/>
-          <w:b/>
-          <w:bCs/>
-          <w:sz w:val="21"/>
-          <w:szCs w:val="21"/>
-        </w:rPr>
-        <w:t xml:space="preserve">AI / AGI / SI: </w:t>
-      </w:r>
-      <w:r>
-        <w:rPr>
-          <w:rFonts w:ascii="Malgun Gothic" w:cs="Malgun Gothic" w:eastAsia="Malgun Gothic" w:hAnsi="Malgun Gothic"/>
-          <w:sz w:val="21"/>
-          <w:szCs w:val="21"/>
-        </w:rPr>
-        <w:t xml:space="preserve">통상 AI는 넓은 기술 범주, AGI는 인간 수준의 범용 지능, 초지능(SI)은 인간을 넘어서는 지능을 가리킨다. 이번 행정명령은 SI를 ‘현행 법상 AI 전체’로 정의해 일반적 용법과 다르게 쓰고 있다.</w:t>
+        <w:t xml:space="preserve">행정명령의 적용 대상. 공식 서신, 공공 커뮤니케이션, 정부 웹사이트, 보고서, 정책 문서 등.</w:t>
+      </w:r>
+    </w:p>
+    <w:p>
+      <w:pPr>
+        <w:pStyle w:val="ListParagraph"/>
+        <w:numPr>
+          <w:ilvl w:val="0"/>
+          <w:numId w:val="2"/>
+        </w:numPr>
+        <w:spacing w:after="80" w:line="300"/>
+      </w:pPr>
+      <w:r>
+        <w:rPr>
+          <w:rFonts w:ascii="Malgun Gothic" w:cs="Malgun Gothic" w:eastAsia="Malgun Gothic" w:hAnsi="Malgun Gothic"/>
+          <w:b/>
+          <w:bCs/>
+          <w:sz w:val="21"/>
+          <w:szCs w:val="21"/>
+        </w:rPr>
+        <w:t xml:space="preserve">APST: </w:t>
+      </w:r>
+      <w:r>
+        <w:rPr>
+          <w:rFonts w:ascii="Malgun Gothic" w:cs="Malgun Gothic" w:eastAsia="Malgun Gothic" w:hAnsi="Malgun Gothic"/>
+          <w:sz w:val="21"/>
+          <w:szCs w:val="21"/>
+        </w:rPr>
+        <w:t xml:space="preserve">대통령 과학기술보좌관. SI 연방 정의 입법 문안의 제출 주체.</w:t>
       </w:r>
     </w:p>
     <w:p>
@@ -1277,41 +1277,6 @@
           <w:szCs w:val="21"/>
         </w:rPr>
         <w:t xml:space="preserve">#AI정책 #슈퍼인텔리전스 #미국행정명령 #트럼프행정부 #AI거버넌스 #프레이밍 #용어정치 #기술패권</w:t>
-      </w:r>
-    </w:p>
-    <w:p>
-      <w:pPr>
-        <w:pStyle w:val="Heading1"/>
-        <w:spacing w:after="120" w:before="300"/>
-      </w:pPr>
-      <w:r>
-        <w:rPr>
-          <w:rFonts w:ascii="Malgun Gothic" w:cs="Malgun Gothic" w:eastAsia="Malgun Gothic" w:hAnsi="Malgun Gothic"/>
-          <w:b/>
-          <w:bCs/>
-          <w:color w:val="1F3864"/>
-          <w:sz w:val="28"/>
-          <w:szCs w:val="28"/>
-        </w:rPr>
-        <w:t xml:space="preserve">11. 관련 노트</w:t>
-      </w:r>
-    </w:p>
-    <w:p>
-      <w:pPr>
-        <w:pStyle w:val="ListParagraph"/>
-        <w:numPr>
-          <w:ilvl w:val="0"/>
-          <w:numId w:val="2"/>
-        </w:numPr>
-        <w:spacing w:after="80" w:line="300"/>
-      </w:pPr>
-      <w:r>
-        <w:rPr>
-          <w:rFonts w:ascii="Malgun Gothic" w:cs="Malgun Gothic" w:eastAsia="Malgun Gothic" w:hAnsi="Malgun Gothic"/>
-          <w:sz w:val="21"/>
-          <w:szCs w:val="21"/>
-        </w:rPr>
-        <w:t xml:space="preserve">[한겨레-2026-09-30-[인터뷰] 구글 떠난 연구원 “AI는 스스로 자란다, 해결책도 없다”] — 같은 날 기사. 초지능을 ‘중단해야 할 위험’으로 보는 관점과 ‘국가 경쟁력의 상징’으로 내세우는 관점의 대비.</w:t>
       </w:r>
     </w:p>
     <w:sectPr>

</xml_diff>